<commit_message>
10 marks error corrected
</commit_message>
<xml_diff>
--- a/Deepak_Narayan_Resume.docx
+++ b/Deepak_Narayan_Resume.docx
@@ -1189,7 +1189,13 @@
         <w:rPr>
           <w:rStyle w:val="span"/>
         </w:rPr>
-        <w:t>Percentage: 88</w:t>
+        <w:t>Percentage: 8</w:t>
+      </w:r>
+      <w:r>
+        <w:rPr>
+          <w:rStyle w:val="span"/>
+        </w:rPr>
+        <w:t>6.7</w:t>
       </w:r>
     </w:p>
     <w:p>

</xml_diff>